<commit_message>
final edits for E&E before coauthor sign off
</commit_message>
<xml_diff>
--- a/docs/manuscript/paper.docx
+++ b/docs/manuscript/paper.docx
@@ -280,7 +280,7 @@
         <w:t xml:space="preserve"> </w:t>
       </w:r>
       <w:r>
-        <w:t xml:space="preserve">(Sparks et al. 2025)</w:t>
+        <w:t xml:space="preserve">(Sparks et al. 2026)</w:t>
       </w:r>
       <w:r>
         <w:t xml:space="preserve"> </w:t>
@@ -796,19 +796,19 @@
         <w:pStyle w:val="FirstParagraph"/>
       </w:pPr>
       <w:r>
-        <w:t xml:space="preserve">While effective value models are premised on experimental data, often using fixed temperature treatments, because they accurately account for the daily contribution to development, they may be applied to fluctuating regimes.</w:t>
-      </w:r>
-      <w:r>
-        <w:t xml:space="preserve"> </w:t>
-      </w:r>
-      <w:r>
-        <w:t xml:space="preserve">Sparks (2016)</w:t>
-      </w:r>
-      <w:r>
-        <w:t xml:space="preserve"> </w:t>
-      </w:r>
-      <w:r>
-        <w:t xml:space="preserve">reparameterized model 2 from</w:t>
+        <w:t xml:space="preserve">Effective value models are premised on experimental data, often using fixed temperature treatments. However, because they accurately account for the daily contribution to development, they may be applied to fluctuating regimes.</w:t>
+      </w:r>
+      <w:r>
+        <w:t xml:space="preserve"> </w:t>
+      </w:r>
+      <w:r>
+        <w:t xml:space="preserve">Sparks et al. (2017)</w:t>
+      </w:r>
+      <w:r>
+        <w:t xml:space="preserve"> </w:t>
+      </w:r>
+      <w:r>
+        <w:t xml:space="preserve">reparameterized Model 2 from</w:t>
       </w:r>
       <w:r>
         <w:t xml:space="preserve"> </w:t>
@@ -830,7 +830,7 @@
         <w:t xml:space="preserve">Oncorhynchus nerka</w:t>
       </w:r>
       <w:r>
-        <w:t xml:space="preserve">) using common garden data and demonstrated how effective value models can be parameterized using average temperatures over the course of development to predict hatch timing for embryos receiving daily fluctuating temperatures.</w:t>
+        <w:t xml:space="preserve">) using common garden data and demonstrated how effective value models can be parameterized using average temperatures over the course of development to predict hatch timing for embryos receiving daily fluctuating temperatures, with perfect concordance between model estimates and empirical data.</w:t>
       </w:r>
     </w:p>
     <w:p>
@@ -838,7 +838,7 @@
         <w:pStyle w:val="BodyText"/>
       </w:pPr>
       <w:r>
-        <w:t xml:space="preserve">To illustrate this process, we developed a custom effective value model for the coastal tailed frog (</w:t>
+        <w:t xml:space="preserve">To illustrate how a model can be parameterized, we developed a custom effective value model for the coastal tailed frog (</w:t>
       </w:r>
       <w:r>
         <w:rPr>
@@ -1106,7 +1106,7 @@
         </w:numPr>
       </w:pPr>
       <w:r>
-        <w:t xml:space="preserve">Some record of temperatures that can be summarized to a average daily time-step.</w:t>
+        <w:t xml:space="preserve">Some record of temperatures that can be summarized to an average daily time-step.</w:t>
       </w:r>
     </w:p>
     <w:p>
@@ -1210,7 +1210,16 @@
         <w:t xml:space="preserve"> </w:t>
       </w:r>
       <w:r>
-        <w:t xml:space="preserve">(as demonstrated in Figure 1), allowing users to build tailored effective value models for diverse taxa. The examples span seven taxonomic classes—amphibians, reptiles, insects, crustaceans, copepods, cephalopods, and asteroids (starfishes) —and demonstrate the breadth of systems to which this approach can be applied. While the case studies we present here are intended as proof-of-concept, we anticipate that applications will continue to expand alongside the growing availability of temperature–development datasets.</w:t>
+        <w:t xml:space="preserve">(as demonstrated in Figure 1), allowing users to build tailored effective value models for diverse taxa. The examples span seven taxonomic classes—amphibians, reptiles, insects, crustaceans, copepods, cephalopods, and asteroids (starfishes) —and demonstrate the breadth of systems to which this approach can be applied (for examples with fishes, see</w:t>
+      </w:r>
+      <w:r>
+        <w:t xml:space="preserve"> </w:t>
+      </w:r>
+      <w:r>
+        <w:t xml:space="preserve">(Sparks et al. 2026)</w:t>
+      </w:r>
+      <w:r>
+        <w:t xml:space="preserve">. While the case studies we present here are intended as proof-of-concept, we anticipate that applications will continue to expand alongside the growing availability of temperature–development datasets.</w:t>
       </w:r>
     </w:p>
     <w:bookmarkStart w:id="29" w:name="X334f715e53d1bdc588a68ff6fffa52905048556"/>
@@ -1312,7 +1321,19 @@
         <w:t xml:space="preserve">i.e.</w:t>
       </w:r>
       <w:r>
-        <w:t xml:space="preserve">, COMIDs from the National Hydrogrpahy Dataset) nested within four mountain ranges: Olympic National Park, the Cascade Mountains, the Siskiyou Mountains, and the Willapa Hills. Each COMID had between 20 and 30 years of predictions.</w:t>
+        <w:t xml:space="preserve">, COMIDs from the National Hydrogrpahy Dataset)</w:t>
+      </w:r>
+      <w:r>
+        <w:t xml:space="preserve"> </w:t>
+      </w:r>
+      <w:r>
+        <w:t xml:space="preserve">(McKay et al. 2012)</w:t>
+      </w:r>
+      <w:r>
+        <w:t xml:space="preserve"> </w:t>
+      </w:r>
+      <w:r>
+        <w:t xml:space="preserve">nested within four mountain ranges: Olympic National Park, the Cascade Mountains, the Siskiyou Mountains, and the Willapa Hills. Each stream reach had between 20 and 30 years of predictions.</w:t>
       </w:r>
     </w:p>
     <w:p>
@@ -1320,7 +1341,7 @@
         <w:pStyle w:val="BodyText"/>
       </w:pPr>
       <w:r>
-        <w:t xml:space="preserve">We evaluated eight candidate linear models that varied in the inclusion and interaction of year, stream reach, and mountain range effects. Based on adjusted R², AICc, and RMSE, the best-supported model included year and stream reach (COMID) as additive fixed effects: days_to_hatch ~ year + COMID.</w:t>
+        <w:t xml:space="preserve">We evaluated eight candidate linear models that varied in the inclusion and interaction of year, stream reach, and mountain range effects. Based on adjusted R², AICc, and RMSE, the best-supported model included year and stream reach (COMID) as additive fixed effects: days_to_hatch ~ year + stream reach.</w:t>
       </w:r>
     </w:p>
     <w:p>
@@ -1597,7 +1618,7 @@
         <w:t xml:space="preserve">(Conover et al. 2009, Sparks et al. 2022)</w:t>
       </w:r>
       <w:r>
-        <w:t xml:space="preserve">. These differences are especially pronounced at cooler temperatures, suggesting that local adaptation may only manifest under certain environmental conditions. Moreover, the consistent rank order of developmental rates across the populations indicates heritable differences among populations which have and can continue to be selected upon in changing environments.</w:t>
+        <w:t xml:space="preserve">. These differences are especially pronounced at warmer temperatures, suggesting that local adaptation manifests differentially under certain environmental conditions. Moreover, the consistent rank order of developmental rates across the populations indicates heritable differences among populations which have and can continue to be selected upon in changing environments.</w:t>
       </w:r>
     </w:p>
     <w:p>
@@ -1623,6 +1644,22 @@
       <w:r>
         <w:t xml:space="preserve">can be used to explore the intersection of developmental plasticity and local adaptation in a novel framework. Such applications are useful for disentangling the genetic basis of thermal sensitivity, anticipating geographic responses to changing temperatures, and informing population-specific management strategies.</w:t>
       </w:r>
+      <w:r>
+        <w:t xml:space="preserve"> </w:t>
+      </w:r>
+      <w:r>
+        <w:t xml:space="preserve">(</w:t>
+      </w:r>
+      <w:r>
+        <w:rPr>
+          <w:b/>
+          <w:bCs/>
+        </w:rPr>
+        <w:t xml:space="preserve">spark?</w:t>
+      </w:r>
+      <w:r>
+        <w:t xml:space="preserve">)</w:t>
+      </w:r>
     </w:p>
     <w:bookmarkEnd w:id="31"/>
     <w:bookmarkEnd w:id="32"/>
@@ -1720,7 +1757,7 @@
         <w:t xml:space="preserve"> </w:t>
       </w:r>
       <w:r>
-        <w:t xml:space="preserve">through a compilation of parameterizable datasets spanningseven taxonomic classes and through three case studies that illustrate ecological, evolutionary, and conservation applications. These case studies span field data, phylogenetic comparisons, and experimental designs, demonstrating the tool’s flexibility across data types and biological questions.</w:t>
+        <w:t xml:space="preserve">through a compilation of parameterizable datasets spanning seven taxonomic classes and through three case studies that illustrate ecological, evolutionary, and conservation applications. These case studies span field data, phylogenetic comparisons, and experimental designs, demonstrating the tool’s flexibility across data types and biological questions.</w:t>
       </w:r>
     </w:p>
     <w:p>
@@ -1761,13 +1798,13 @@
         <w:pStyle w:val="BodyText"/>
       </w:pPr>
       <w:r>
-        <w:t xml:space="preserve">We attempted to validate models with phenological data from wild popualtions, but we found no examples where we could parameterize a model at the population-level and then use it to predict phenology for which that population had empirical data in the wild.</w:t>
-      </w:r>
-      <w:r>
-        <w:t xml:space="preserve"> </w:t>
-      </w:r>
-      <w:r>
-        <w:t xml:space="preserve">Sparks (2016)</w:t>
+        <w:t xml:space="preserve">We attempted to validate models with phenological data from wild populations, but we found no examples where we could parameterize a model at the population-level and then use it to predict phenology for which that population had empirical data in the wild.</w:t>
+      </w:r>
+      <w:r>
+        <w:t xml:space="preserve"> </w:t>
+      </w:r>
+      <w:r>
+        <w:t xml:space="preserve">Sparks et al. (2017)</w:t>
       </w:r>
       <w:r>
         <w:t xml:space="preserve"> </w:t>
@@ -1819,7 +1856,7 @@
         <w:t xml:space="preserve"> </w:t>
       </w:r>
       <w:r>
-        <w:t xml:space="preserve">Sparks et al. (2025)</w:t>
+        <w:t xml:space="preserve">Sparks et al. (2026)</w:t>
       </w:r>
       <w:r>
         <w:t xml:space="preserve">, we recommend using experimental data with at least four distinct temperature treatments spanning a wide thermal range. This is critical for capturing the nonlinear shape of developmental rate curves and avoiding overfitting or extrapolation errors. Many studies we encountered—particularly older or gray literature—relied on only two temperature treatments</w:t>
@@ -2093,7 +2130,7 @@
       </w:r>
     </w:p>
     <w:bookmarkEnd w:id="40"/>
-    <w:bookmarkStart w:id="117" w:name="references"/>
+    <w:bookmarkStart w:id="115" w:name="references"/>
     <w:p>
       <w:pPr>
         <w:pStyle w:val="Heading1"/>
@@ -2102,7 +2139,7 @@
         <w:t xml:space="preserve">References</w:t>
       </w:r>
     </w:p>
-    <w:bookmarkStart w:id="116" w:name="refs"/>
+    <w:bookmarkStart w:id="114" w:name="refs"/>
     <w:bookmarkStart w:id="41" w:name="ref-angilletta2006"/>
     <w:p>
       <w:pPr>
@@ -2937,18 +2974,28 @@
       </w:r>
     </w:p>
     <w:bookmarkEnd w:id="80"/>
-    <w:bookmarkStart w:id="82" w:name="ref-moore1939"/>
+    <w:bookmarkStart w:id="81" w:name="ref-mckay2012"/>
     <w:p>
       <w:pPr>
         <w:pStyle w:val="Bibliography"/>
       </w:pPr>
       <w:r>
+        <w:t xml:space="preserve">McKay, L., T. Bondelid, T. Dewald, J. Johnson, R. Moore, and A. Rea. 2012. NHDPlus version 2: User guide.</w:t>
+      </w:r>
+    </w:p>
+    <w:bookmarkEnd w:id="81"/>
+    <w:bookmarkStart w:id="83" w:name="ref-moore1939"/>
+    <w:p>
+      <w:pPr>
+        <w:pStyle w:val="Bibliography"/>
+      </w:pPr>
+      <w:r>
         <w:t xml:space="preserve">Moore, J. A. 1939.</w:t>
       </w:r>
       <w:r>
         <w:t xml:space="preserve"> </w:t>
       </w:r>
-      <w:hyperlink r:id="rId81">
+      <w:hyperlink r:id="rId82">
         <w:r>
           <w:rPr>
             <w:rStyle w:val="Hyperlink"/>
@@ -2960,8 +3007,8 @@
         <w:t xml:space="preserve">. Ecology 20:459–478.</w:t>
       </w:r>
     </w:p>
-    <w:bookmarkEnd w:id="82"/>
-    <w:bookmarkStart w:id="83" w:name="ref-neuheimer2007"/>
+    <w:bookmarkEnd w:id="83"/>
+    <w:bookmarkStart w:id="84" w:name="ref-neuheimer2007"/>
     <w:p>
       <w:pPr>
         <w:pStyle w:val="Bibliography"/>
@@ -2970,8 +3017,8 @@
         <w:t xml:space="preserve">Neuheimer, A. B., and C. T. Taggart. 2007. The growing degree-day and fish size-at-age: The overlooked metric. Canadian Journal of Fisheries and Aquatic Sciences 64:375–385.</w:t>
       </w:r>
     </w:p>
-    <w:bookmarkEnd w:id="83"/>
-    <w:bookmarkStart w:id="85" w:name="ref-pinsky2019"/>
+    <w:bookmarkEnd w:id="84"/>
+    <w:bookmarkStart w:id="86" w:name="ref-pinsky2019"/>
     <w:p>
       <w:pPr>
         <w:pStyle w:val="Bibliography"/>
@@ -2982,7 +3029,7 @@
       <w:r>
         <w:t xml:space="preserve"> </w:t>
       </w:r>
-      <w:hyperlink r:id="rId84">
+      <w:hyperlink r:id="rId85">
         <w:r>
           <w:rPr>
             <w:rStyle w:val="Hyperlink"/>
@@ -2994,8 +3041,8 @@
         <w:t xml:space="preserve">. Nature 569:108–111.</w:t>
       </w:r>
     </w:p>
-    <w:bookmarkEnd w:id="85"/>
-    <w:bookmarkStart w:id="87" w:name="ref-pritchard1987"/>
+    <w:bookmarkEnd w:id="86"/>
+    <w:bookmarkStart w:id="88" w:name="ref-pritchard1987"/>
     <w:p>
       <w:pPr>
         <w:pStyle w:val="Bibliography"/>
@@ -3006,7 +3053,7 @@
       <w:r>
         <w:t xml:space="preserve"> </w:t>
       </w:r>
-      <w:hyperlink r:id="rId86">
+      <w:hyperlink r:id="rId87">
         <w:r>
           <w:rPr>
             <w:rStyle w:val="Hyperlink"/>
@@ -3018,8 +3065,8 @@
         <w:t xml:space="preserve">. Advances in odonatology 3:121–126.</w:t>
       </w:r>
     </w:p>
-    <w:bookmarkEnd w:id="87"/>
-    <w:bookmarkStart w:id="89" w:name="ref-qualls1998"/>
+    <w:bookmarkEnd w:id="88"/>
+    <w:bookmarkStart w:id="90" w:name="ref-qualls1998"/>
     <w:p>
       <w:pPr>
         <w:pStyle w:val="Bibliography"/>
@@ -3030,7 +3077,7 @@
       <w:r>
         <w:t xml:space="preserve"> </w:t>
       </w:r>
-      <w:hyperlink r:id="rId88">
+      <w:hyperlink r:id="rId89">
         <w:r>
           <w:rPr>
             <w:rStyle w:val="Hyperlink"/>
@@ -3042,8 +3089,8 @@
         <w:t xml:space="preserve">. Biological Journal of the Linnean Society 64:477–491.</w:t>
       </w:r>
     </w:p>
-    <w:bookmarkEnd w:id="89"/>
-    <w:bookmarkStart w:id="90" w:name="ref-schoolfield1981"/>
+    <w:bookmarkEnd w:id="90"/>
+    <w:bookmarkStart w:id="91" w:name="ref-schoolfield1981"/>
     <w:p>
       <w:pPr>
         <w:pStyle w:val="Bibliography"/>
@@ -3052,8 +3099,8 @@
         <w:t xml:space="preserve">Schoolfield, R. M., P. Sharpe, and C. E. Magnuson. 1981. Non-linear regression of biological temperature-dependent rate models based on absolute reaction-rate theory. Journal of theoretical biology 88:719–731.</w:t>
       </w:r>
     </w:p>
-    <w:bookmarkEnd w:id="90"/>
-    <w:bookmarkStart w:id="92" w:name="ref-siegel2023"/>
+    <w:bookmarkEnd w:id="91"/>
+    <w:bookmarkStart w:id="93" w:name="ref-siegel2023"/>
     <w:p>
       <w:pPr>
         <w:pStyle w:val="Bibliography"/>
@@ -3064,7 +3111,7 @@
       <w:r>
         <w:t xml:space="preserve"> </w:t>
       </w:r>
-      <w:hyperlink r:id="rId91">
+      <w:hyperlink r:id="rId92">
         <w:r>
           <w:rPr>
             <w:rStyle w:val="Hyperlink"/>
@@ -3076,24 +3123,14 @@
         <w:t xml:space="preserve">. PLOS Water 2:e0000119.</w:t>
       </w:r>
     </w:p>
-    <w:bookmarkEnd w:id="92"/>
-    <w:bookmarkStart w:id="93" w:name="ref-sih2004"/>
+    <w:bookmarkEnd w:id="93"/>
+    <w:bookmarkStart w:id="94" w:name="ref-sih2004"/>
     <w:p>
       <w:pPr>
         <w:pStyle w:val="Bibliography"/>
       </w:pPr>
       <w:r>
         <w:t xml:space="preserve">Sih, A., A. M. Bell, and J. L. Kerby. 2004. Two stressors are far deadlier than one. Trends in ecology &amp; evolution 19:274–276.</w:t>
-      </w:r>
-    </w:p>
-    <w:bookmarkEnd w:id="93"/>
-    <w:bookmarkStart w:id="94" w:name="ref-sparks2016"/>
-    <w:p>
-      <w:pPr>
-        <w:pStyle w:val="Bibliography"/>
-      </w:pPr>
-      <w:r>
-        <w:t xml:space="preserve">Sparks, M. M. 2016. Climate, embryonic development, and potential for adaptation to warming water temperatures by bristol bay sockeye salmon. PhD thesis, Fairbanks, AK.</w:t>
       </w:r>
     </w:p>
     <w:bookmarkEnd w:id="94"/>
@@ -3169,13 +3206,13 @@
       </w:r>
     </w:p>
     <w:bookmarkEnd w:id="100"/>
-    <w:bookmarkStart w:id="102" w:name="ref-sparks2025"/>
+    <w:bookmarkStart w:id="102" w:name="ref-sparks2017"/>
     <w:p>
       <w:pPr>
         <w:pStyle w:val="Bibliography"/>
       </w:pPr>
       <w:r>
-        <w:t xml:space="preserve">Sparks, M. M., B. M. Maitland, E. Felts, A. Swartz, and P. Frater. 2025.</w:t>
+        <w:t xml:space="preserve">Sparks, M. M., P. A. H. Westley, J. A. Falke, and T. P. Quinn. 2017.</w:t>
       </w:r>
       <w:r>
         <w:t xml:space="preserve"> </w:t>
@@ -3185,27 +3222,21 @@
           <w:rPr>
             <w:rStyle w:val="Hyperlink"/>
           </w:rPr>
-          <w:t xml:space="preserve">hatchR</w:t>
-        </w:r>
-        <w:r>
-          <w:rPr>
-            <w:rStyle w:val="Hyperlink"/>
-          </w:rPr>
-          <w:t xml:space="preserve">: A toolset to predict when fish hatch and emerge</w:t>
+          <w:t xml:space="preserve">Thermal adaptation and phenotypic plasticity in a warming world: Insights from common garden experiments on Alaskan sockeye salmon</w:t>
         </w:r>
       </w:hyperlink>
       <w:r>
-        <w:t xml:space="preserve">. CRAN.</w:t>
+        <w:t xml:space="preserve">. Global Change Biology 23:5203–5217.</w:t>
       </w:r>
     </w:p>
     <w:bookmarkEnd w:id="102"/>
-    <w:bookmarkStart w:id="104" w:name="ref-sparks2017"/>
+    <w:bookmarkStart w:id="104" w:name="ref-steel2012"/>
     <w:p>
       <w:pPr>
         <w:pStyle w:val="Bibliography"/>
       </w:pPr>
       <w:r>
-        <w:t xml:space="preserve">Sparks, M. M., P. A. H. Westley, J. A. Falke, and T. P. Quinn. 2017.</w:t>
+        <w:t xml:space="preserve">Steel, E. A., A. Tillotson, D. A. Larsen, A. H. Fullerton, K. P. Denton, and B. R. Beckman. 2012.</w:t>
       </w:r>
       <w:r>
         <w:t xml:space="preserve"> </w:t>
@@ -3215,21 +3246,21 @@
           <w:rPr>
             <w:rStyle w:val="Hyperlink"/>
           </w:rPr>
-          <w:t xml:space="preserve">Thermal adaptation and phenotypic plasticity in a warming world: Insights from common garden experiments on Alaskan sockeye salmon</w:t>
+          <w:t xml:space="preserve">Beyond the mean: The role of variability in predicting ecological effects of stream temperature on salmon</w:t>
         </w:r>
       </w:hyperlink>
       <w:r>
-        <w:t xml:space="preserve">. Global Change Biology 23:5203–5217.</w:t>
+        <w:t xml:space="preserve">. Ecosphere 3:art104.</w:t>
       </w:r>
     </w:p>
     <w:bookmarkEnd w:id="104"/>
-    <w:bookmarkStart w:id="106" w:name="ref-steel2012"/>
+    <w:bookmarkStart w:id="106" w:name="ref-tang2017"/>
     <w:p>
       <w:pPr>
         <w:pStyle w:val="Bibliography"/>
       </w:pPr>
       <w:r>
-        <w:t xml:space="preserve">Steel, E. A., A. Tillotson, D. A. Larsen, A. H. Fullerton, K. P. Denton, and B. R. Beckman. 2012.</w:t>
+        <w:t xml:space="preserve">Tang, J., H. He, C. Chen, S. Fu, and F. Xue. 2017.</w:t>
       </w:r>
       <w:r>
         <w:t xml:space="preserve"> </w:t>
@@ -3239,50 +3270,26 @@
           <w:rPr>
             <w:rStyle w:val="Hyperlink"/>
           </w:rPr>
-          <w:t xml:space="preserve">Beyond the mean: The role of variability in predicting ecological effects of stream temperature on salmon</w:t>
+          <w:t xml:space="preserve">Latitudinal cogradient variation of development time and growth rate and a negative latitudinal body weight cline in a widely distributed cabbage beetle</w:t>
         </w:r>
       </w:hyperlink>
       <w:r>
-        <w:t xml:space="preserve">. Ecosphere 3:art104.</w:t>
+        <w:t xml:space="preserve">. PLOS ONE 12:e0181030.</w:t>
       </w:r>
     </w:p>
     <w:bookmarkEnd w:id="106"/>
-    <w:bookmarkStart w:id="108" w:name="ref-tang2017"/>
+    <w:bookmarkStart w:id="108" w:name="ref-vandamme1992"/>
     <w:p>
       <w:pPr>
         <w:pStyle w:val="Bibliography"/>
       </w:pPr>
       <w:r>
-        <w:t xml:space="preserve">Tang, J., H. He, C. Chen, S. Fu, and F. Xue. 2017.</w:t>
+        <w:t xml:space="preserve">Van Damme, R., D. Bauwens, F. Braña, and R. F. Verheyen. 1992.</w:t>
       </w:r>
       <w:r>
         <w:t xml:space="preserve"> </w:t>
       </w:r>
       <w:hyperlink r:id="rId107">
-        <w:r>
-          <w:rPr>
-            <w:rStyle w:val="Hyperlink"/>
-          </w:rPr>
-          <w:t xml:space="preserve">Latitudinal cogradient variation of development time and growth rate and a negative latitudinal body weight cline in a widely distributed cabbage beetle</w:t>
-        </w:r>
-      </w:hyperlink>
-      <w:r>
-        <w:t xml:space="preserve">. PLOS ONE 12:e0181030.</w:t>
-      </w:r>
-    </w:p>
-    <w:bookmarkEnd w:id="108"/>
-    <w:bookmarkStart w:id="110" w:name="ref-vandamme1992"/>
-    <w:p>
-      <w:pPr>
-        <w:pStyle w:val="Bibliography"/>
-      </w:pPr>
-      <w:r>
-        <w:t xml:space="preserve">Van Damme, R., D. Bauwens, F. Braña, and R. F. Verheyen. 1992.</w:t>
-      </w:r>
-      <w:r>
-        <w:t xml:space="preserve"> </w:t>
-      </w:r>
-      <w:hyperlink r:id="rId109">
         <w:r>
           <w:rPr>
             <w:rStyle w:val="Hyperlink"/>
@@ -3316,73 +3323,73 @@
         <w:t xml:space="preserve">. Herpetologica 48:220–228.</w:t>
       </w:r>
     </w:p>
+    <w:bookmarkEnd w:id="108"/>
+    <w:bookmarkStart w:id="110" w:name="ref-warkentin2011"/>
+    <w:p>
+      <w:pPr>
+        <w:pStyle w:val="Bibliography"/>
+      </w:pPr>
+      <w:r>
+        <w:t xml:space="preserve">Warkentin, K. M. 2011.</w:t>
+      </w:r>
+      <w:r>
+        <w:t xml:space="preserve"> </w:t>
+      </w:r>
+      <w:hyperlink r:id="rId109">
+        <w:r>
+          <w:rPr>
+            <w:rStyle w:val="Hyperlink"/>
+          </w:rPr>
+          <w:t xml:space="preserve">Environmentally cued hatching across taxa: Embryos respond to risk and opportunity</w:t>
+        </w:r>
+      </w:hyperlink>
+      <w:r>
+        <w:t xml:space="preserve">. Integrative and Comparative Biology 51:14–25.</w:t>
+      </w:r>
+    </w:p>
     <w:bookmarkEnd w:id="110"/>
-    <w:bookmarkStart w:id="112" w:name="ref-warkentin2011"/>
+    <w:bookmarkStart w:id="111" w:name="ref-west-eberhard2003"/>
     <w:p>
       <w:pPr>
         <w:pStyle w:val="Bibliography"/>
       </w:pPr>
       <w:r>
-        <w:t xml:space="preserve">Warkentin, K. M. 2011.</w:t>
-      </w:r>
-      <w:r>
-        <w:t xml:space="preserve"> </w:t>
-      </w:r>
-      <w:hyperlink r:id="rId111">
-        <w:r>
-          <w:rPr>
-            <w:rStyle w:val="Hyperlink"/>
-          </w:rPr>
-          <w:t xml:space="preserve">Environmentally cued hatching across taxa: Embryos respond to risk and opportunity</w:t>
+        <w:t xml:space="preserve">West-Eberhard, M. J. 2003. Developmental Plasticity and Evolution. Oxford University Press.</w:t>
+      </w:r>
+    </w:p>
+    <w:bookmarkEnd w:id="111"/>
+    <w:bookmarkStart w:id="113" w:name="ref-while2018"/>
+    <w:p>
+      <w:pPr>
+        <w:pStyle w:val="Bibliography"/>
+      </w:pPr>
+      <w:r>
+        <w:t xml:space="preserve">While, G. M., D. W. A. Noble, T. Uller, D. A. Warner, J. L. Riley, W.-G. Du, and L. E. Schwanz. 2018.</w:t>
+      </w:r>
+      <w:r>
+        <w:t xml:space="preserve"> </w:t>
+      </w:r>
+      <w:hyperlink r:id="rId112">
+        <w:r>
+          <w:rPr>
+            <w:rStyle w:val="Hyperlink"/>
+          </w:rPr>
+          <w:t xml:space="preserve">Patterns of developmental plasticity in response to incubation temperature in reptiles</w:t>
         </w:r>
       </w:hyperlink>
       <w:r>
-        <w:t xml:space="preserve">. Integrative and Comparative Biology 51:14–25.</w:t>
-      </w:r>
-    </w:p>
-    <w:bookmarkEnd w:id="112"/>
-    <w:bookmarkStart w:id="113" w:name="ref-west-eberhard2003"/>
-    <w:p>
-      <w:pPr>
-        <w:pStyle w:val="Bibliography"/>
-      </w:pPr>
-      <w:r>
-        <w:t xml:space="preserve">West-Eberhard, M. J. 2003. Developmental Plasticity and Evolution. Oxford University Press.</w:t>
+        <w:t xml:space="preserve">. Journal of Experimental Zoology Part A: Ecological and Integrative Physiology 329:162–176.</w:t>
       </w:r>
     </w:p>
     <w:bookmarkEnd w:id="113"/>
-    <w:bookmarkStart w:id="115" w:name="ref-while2018"/>
-    <w:p>
-      <w:pPr>
-        <w:pStyle w:val="Bibliography"/>
-      </w:pPr>
-      <w:r>
-        <w:t xml:space="preserve">While, G. M., D. W. A. Noble, T. Uller, D. A. Warner, J. L. Riley, W.-G. Du, and L. E. Schwanz. 2018.</w:t>
-      </w:r>
-      <w:r>
-        <w:t xml:space="preserve"> </w:t>
-      </w:r>
-      <w:hyperlink r:id="rId114">
-        <w:r>
-          <w:rPr>
-            <w:rStyle w:val="Hyperlink"/>
-          </w:rPr>
-          <w:t xml:space="preserve">Patterns of developmental plasticity in response to incubation temperature in reptiles</w:t>
-        </w:r>
-      </w:hyperlink>
-      <w:r>
-        <w:t xml:space="preserve">. Journal of Experimental Zoology Part A: Ecological and Integrative Physiology 329:162–176.</w:t>
+    <w:bookmarkEnd w:id="114"/>
+    <w:p>
+      <w:r>
+        <w:br w:type="page"/>
       </w:r>
     </w:p>
     <w:bookmarkEnd w:id="115"/>
-    <w:bookmarkEnd w:id="116"/>
-    <w:p>
-      <w:r>
-        <w:br w:type="page"/>
-      </w:r>
-    </w:p>
-    <w:bookmarkEnd w:id="117"/>
-    <w:bookmarkStart w:id="118" w:name="tables"/>
+    <w:bookmarkStart w:id="116" w:name="tables"/>
     <w:p>
       <w:pPr>
         <w:pStyle w:val="Heading1"/>
@@ -5564,8 +5571,8 @@
         <w:br w:type="page"/>
       </w:r>
     </w:p>
-    <w:bookmarkEnd w:id="118"/>
-    <w:bookmarkStart w:id="119" w:name="figure-captions"/>
+    <w:bookmarkEnd w:id="116"/>
+    <w:bookmarkStart w:id="117" w:name="figure-captions"/>
     <w:p>
       <w:pPr>
         <w:pStyle w:val="Heading1"/>
@@ -5607,7 +5614,7 @@
         <w:t xml:space="preserve">Ascaphus truei</w:t>
       </w:r>
       <w:r>
-        <w:t xml:space="preserve">) from 1991 to 2020s using effective value model parameterized in this study. Panel A: Marginal mean trend across all sites shows a significant decline in days to hatching over time. Panel B: Site- and reach-specific (COMID) trends in predicted days to hatch, colored by mountain range. Estimates are based on the best fitting model, with stream temperatures from</w:t>
+        <w:t xml:space="preserve">) from 1991 to 2020s using effective value model parameterized in this study (Figure 1). Panel A: Marginal mean trend across all sites shows a significant decline in days to hatching over time. Panel B: Site- and reach-specific (COMID) trends in predicted days to hatch, colored by mountain range. Estimates are based on the best fitting model, with stream temperatures from</w:t>
       </w:r>
       <w:r>
         <w:t xml:space="preserve"> </w:t>
@@ -5655,7 +5662,7 @@
         <w:t xml:space="preserve"> </w:t>
       </w:r>
       <w:r>
-        <w:t xml:space="preserve">and phenology is predicted using two synthetic temperature regimes: Panel A shows predictions under a cooler regime (mean = 16 °C), while Panel B shows predictions under a warmer regime (mean = 24 °C). Horizontal bars and number indicate the predicted days to hatch for a given thermal regime. Panel C displays the effective value curves for each species—linearized thermal reaction norms. The crossover in rank order between Panels A and B illustrates genotype-by-environment interactions, reflecting species-specific thermal niches and breeding strategies.</w:t>
+        <w:t xml:space="preserve">and phenology is predicted using two synthetic temperature variable regimes: Panel A shows predictions under a cooler regime (mean = 16 °C), while Panel B shows predictions under a warmer regime (mean = 24 °C). Horizontal bars and number indicate the predicted days to hatch for a given thermal regime, while the dotted line represents the daily mean temperature. Panel C displays the effective value curves for each species—linearized thermal reaction norms. The crossover in rank order between Panels A and B illustrates genotype-by-environment interactions, reflecting species-specific thermal niches and breeding strategies.</w:t>
       </w:r>
     </w:p>
     <w:p>
@@ -5682,7 +5689,7 @@
         <w:t xml:space="preserve">(Tang et al. 2017)</w:t>
       </w:r>
       <w:r>
-        <w:t xml:space="preserve">. Models were parameterized from common garden experiments under constant temperatures. The southernmost population (Xiushui County) shows a consistently faster developmental rate than populations from more northerly sites, especially at colder temperatures. This pattern is indicative of cogradient variation, where both genetic and environmental effects reinforce the observed phenotypic trend.</w:t>
+        <w:t xml:space="preserve">. Models were parameterized from common garden experiments under constant temperatures. The southernmost population (Xiushui County) shows a consistently faster developmental rate than populations from more northerly sites, especially at warmer temperatures. This pattern is indicative of cogradient variation, where both genetic and environmental effects reinforce the observed phenotypic trend.</w:t>
       </w:r>
     </w:p>
     <w:p>
@@ -5690,8 +5697,8 @@
         <w:br w:type="page"/>
       </w:r>
     </w:p>
-    <w:bookmarkEnd w:id="119"/>
-    <w:bookmarkStart w:id="132" w:name="figures"/>
+    <w:bookmarkEnd w:id="117"/>
+    <w:bookmarkStart w:id="130" w:name="figures"/>
     <w:p>
       <w:pPr>
         <w:pStyle w:val="Heading1"/>
@@ -5709,18 +5716,18 @@
           <wp:inline>
             <wp:extent cx="5943600" cy="2971800"/>
             <wp:effectExtent b="0" l="0" r="0" t="0"/>
-            <wp:docPr descr="" title="" id="121" name="Picture"/>
+            <wp:docPr descr="" title="" id="119" name="Picture"/>
             <a:graphic>
               <a:graphicData uri="http://schemas.openxmlformats.org/drawingml/2006/picture">
                 <pic:pic>
                   <pic:nvPicPr>
-                    <pic:cNvPr descr="paper_files/figure-docx/fig-1-1.png" id="122" name="Picture"/>
+                    <pic:cNvPr descr="paper_files/figure-docx/fig-1-1.png" id="120" name="Picture"/>
                     <pic:cNvPicPr>
                       <a:picLocks noChangeArrowheads="1" noChangeAspect="1"/>
                     </pic:cNvPicPr>
                   </pic:nvPicPr>
                   <pic:blipFill>
-                    <a:blip r:embed="rId120"/>
+                    <a:blip r:embed="rId118"/>
                     <a:stretch>
                       <a:fillRect/>
                     </a:stretch>
@@ -5761,18 +5768,18 @@
           <wp:inline>
             <wp:extent cx="5943600" cy="2971800"/>
             <wp:effectExtent b="0" l="0" r="0" t="0"/>
-            <wp:docPr descr="" title="" id="124" name="Picture"/>
+            <wp:docPr descr="" title="" id="122" name="Picture"/>
             <a:graphic>
               <a:graphicData uri="http://schemas.openxmlformats.org/drawingml/2006/picture">
                 <pic:pic>
                   <pic:nvPicPr>
-                    <pic:cNvPr descr="paper_files/figure-docx/fig-2-1.png" id="125" name="Picture"/>
+                    <pic:cNvPr descr="paper_files/figure-docx/fig-2-1.png" id="123" name="Picture"/>
                     <pic:cNvPicPr>
                       <a:picLocks noChangeArrowheads="1" noChangeAspect="1"/>
                     </pic:cNvPicPr>
                   </pic:nvPicPr>
                   <pic:blipFill>
-                    <a:blip r:embed="rId123"/>
+                    <a:blip r:embed="rId121"/>
                     <a:stretch>
                       <a:fillRect/>
                     </a:stretch>
@@ -5813,18 +5820,18 @@
           <wp:inline>
             <wp:extent cx="5943600" cy="5943600"/>
             <wp:effectExtent b="0" l="0" r="0" t="0"/>
-            <wp:docPr descr="" title="" id="127" name="Picture"/>
+            <wp:docPr descr="" title="" id="125" name="Picture"/>
             <a:graphic>
               <a:graphicData uri="http://schemas.openxmlformats.org/drawingml/2006/picture">
                 <pic:pic>
                   <pic:nvPicPr>
-                    <pic:cNvPr descr="paper_files/figure-docx/fig-3-1.png" id="128" name="Picture"/>
+                    <pic:cNvPr descr="paper_files/figure-docx/fig-3-1.png" id="126" name="Picture"/>
                     <pic:cNvPicPr>
                       <a:picLocks noChangeArrowheads="1" noChangeAspect="1"/>
                     </pic:cNvPicPr>
                   </pic:nvPicPr>
                   <pic:blipFill>
-                    <a:blip r:embed="rId126"/>
+                    <a:blip r:embed="rId124"/>
                     <a:stretch>
                       <a:fillRect/>
                     </a:stretch>
@@ -5865,18 +5872,18 @@
           <wp:inline>
             <wp:extent cx="5943600" cy="2971800"/>
             <wp:effectExtent b="0" l="0" r="0" t="0"/>
-            <wp:docPr descr="" title="" id="130" name="Picture"/>
+            <wp:docPr descr="" title="" id="128" name="Picture"/>
             <a:graphic>
               <a:graphicData uri="http://schemas.openxmlformats.org/drawingml/2006/picture">
                 <pic:pic>
                   <pic:nvPicPr>
-                    <pic:cNvPr descr="paper_files/figure-docx/fig-4-1.png" id="131" name="Picture"/>
+                    <pic:cNvPr descr="paper_files/figure-docx/fig-4-1.png" id="129" name="Picture"/>
                     <pic:cNvPicPr>
                       <a:picLocks noChangeArrowheads="1" noChangeAspect="1"/>
                     </pic:cNvPicPr>
                   </pic:nvPicPr>
                   <pic:blipFill>
-                    <a:blip r:embed="rId129"/>
+                    <a:blip r:embed="rId127"/>
                     <a:stretch>
                       <a:fillRect/>
                     </a:stretch>
@@ -5903,7 +5910,7 @@
         </w:drawing>
       </w:r>
     </w:p>
-    <w:bookmarkEnd w:id="132"/>
+    <w:bookmarkEnd w:id="130"/>
     <w:sectPr>
       <w:footerReference r:id="rId10" w:type="even"/>
       <w:footerReference r:id="rId9" w:type="default"/>

</xml_diff>